<commit_message>
update app Interface in docs
</commit_message>
<xml_diff>
--- a/docs/cvMES.docx
+++ b/docs/cvMES.docx
@@ -688,19 +688,7 @@
         <w:rPr>
           <w:lang w:val="vi-VN"/>
         </w:rPr>
-        <w:t xml:space="preserve"> </w:t>
-      </w:r>
-      <w:r>
-        <w:rPr>
-          <w:lang w:val="vi-VN"/>
-        </w:rPr>
-        <w:t xml:space="preserve">và mô tả các ca sử sụng chi tiết theo từng chức </w:t>
-      </w:r>
-      <w:r>
-        <w:rPr>
-          <w:lang w:val="vi-VN"/>
-        </w:rPr>
-        <w:t>năng, sơ đồ lớp</w:t>
+        <w:t xml:space="preserve"> và mô tả các ca sử sụng chi tiết theo từng chức năng, sơ đồ lớp</w:t>
       </w:r>
       <w:r>
         <w:rPr>
@@ -994,6 +982,1269 @@
           <w:lang w:val="vi-VN"/>
         </w:rPr>
       </w:pPr>
+      <w:r>
+        <w:rPr>
+          <w:lang w:val="vi-VN"/>
+        </w:rPr>
+        <w:t xml:space="preserve">3.2.1. </w:t>
+      </w:r>
+      <w:r>
+        <w:rPr>
+          <w:lang w:val="vi-VN"/>
+        </w:rPr>
+        <w:t>Giao diện</w:t>
+      </w:r>
+      <w:r>
+        <w:rPr>
+          <w:lang w:val="vi-VN"/>
+        </w:rPr>
+        <w:t xml:space="preserve"> màn giám sát</w:t>
+      </w:r>
+    </w:p>
+    <w:p>
+      <w:pPr>
+        <w:rPr>
+          <w:lang w:val="vi-VN"/>
+        </w:rPr>
+      </w:pPr>
+      <w:r>
+        <w:rPr>
+          <w:lang w:val="vi-VN"/>
+        </w:rPr>
+        <w:t>Việc giám sát là một công đoạn quan trọng không thể thiếu trong</w:t>
+      </w:r>
+      <w:r>
+        <w:rPr>
+          <w:lang w:val="vi-VN"/>
+        </w:rPr>
+        <w:t xml:space="preserve"> môi trường</w:t>
+      </w:r>
+      <w:r>
+        <w:rPr>
+          <w:lang w:val="vi-VN"/>
+        </w:rPr>
+        <w:t xml:space="preserve"> sản xuất. </w:t>
+      </w:r>
+      <w:r>
+        <w:rPr>
+          <w:lang w:val="vi-VN"/>
+        </w:rPr>
+        <w:t xml:space="preserve">Nó là yếu tố then chốt đảm bảo tiến độ, chất lượng của sản phẩn trong quá trình sản xuất. </w:t>
+      </w:r>
+    </w:p>
+    <w:p>
+      <w:pPr>
+        <w:rPr>
+          <w:lang w:val="vi-VN"/>
+        </w:rPr>
+      </w:pPr>
+      <w:r>
+        <w:rPr>
+          <w:lang w:val="vi-VN"/>
+        </w:rPr>
+        <w:t>Việc giám sát cần đảm bảo rõ ràng, chính xác từng vị trí, từng loại vật tư đồng thời từng công đoạn trên truyền được thực hiện bởi máy móc hay công nhân cũng phải chính xác.</w:t>
+      </w:r>
+    </w:p>
+    <w:p>
+      <w:pPr>
+        <w:rPr>
+          <w:lang w:val="vi-VN"/>
+        </w:rPr>
+      </w:pPr>
+      <w:r>
+        <w:rPr>
+          <w:lang w:val="vi-VN"/>
+        </w:rPr>
+        <w:t xml:space="preserve">Để làm rõ điều đó, chúng ta có thể nhìn được thông qua màn hình giám sát. Bao gồm các trường thông tin: </w:t>
+      </w:r>
+    </w:p>
+    <w:p>
+      <w:pPr>
+        <w:pStyle w:val="ListParagraph"/>
+        <w:numPr>
+          <w:ilvl w:val="0"/>
+          <w:numId w:val="3"/>
+        </w:numPr>
+        <w:rPr>
+          <w:lang w:val="vi-VN"/>
+        </w:rPr>
+      </w:pPr>
+      <w:r>
+        <w:rPr>
+          <w:lang w:val="vi-VN"/>
+        </w:rPr>
+        <w:t>WO – Work Order:</w:t>
+      </w:r>
+      <w:r>
+        <w:rPr>
+          <w:lang w:val="vi-VN"/>
+        </w:rPr>
+        <w:t xml:space="preserve"> Thông tin đơn hàng </w:t>
+      </w:r>
+    </w:p>
+    <w:p>
+      <w:pPr>
+        <w:pStyle w:val="ListParagraph"/>
+        <w:numPr>
+          <w:ilvl w:val="0"/>
+          <w:numId w:val="3"/>
+        </w:numPr>
+        <w:rPr>
+          <w:lang w:val="vi-VN"/>
+        </w:rPr>
+      </w:pPr>
+      <w:r>
+        <w:rPr>
+          <w:lang w:val="vi-VN"/>
+        </w:rPr>
+        <w:t>Line: Vị trí đơn hàng đang ở đâu</w:t>
+      </w:r>
+    </w:p>
+    <w:p>
+      <w:pPr>
+        <w:pStyle w:val="ListParagraph"/>
+        <w:numPr>
+          <w:ilvl w:val="0"/>
+          <w:numId w:val="3"/>
+        </w:numPr>
+        <w:rPr>
+          <w:lang w:val="vi-VN"/>
+        </w:rPr>
+      </w:pPr>
+      <w:r>
+        <w:rPr>
+          <w:lang w:val="vi-VN"/>
+        </w:rPr>
+        <w:t>Part: Tên, loại bộ phận cấu thành nên sản phẩm</w:t>
+      </w:r>
+    </w:p>
+    <w:p>
+      <w:pPr>
+        <w:pStyle w:val="ListParagraph"/>
+        <w:numPr>
+          <w:ilvl w:val="0"/>
+          <w:numId w:val="3"/>
+        </w:numPr>
+        <w:rPr>
+          <w:lang w:val="vi-VN"/>
+        </w:rPr>
+      </w:pPr>
+      <w:r>
+        <w:rPr>
+          <w:lang w:val="vi-VN"/>
+        </w:rPr>
+        <w:t>SN – Serial Number: Số hiệu sản phẩm</w:t>
+      </w:r>
+    </w:p>
+    <w:p>
+      <w:pPr>
+        <w:pStyle w:val="ListParagraph"/>
+        <w:numPr>
+          <w:ilvl w:val="0"/>
+          <w:numId w:val="3"/>
+        </w:numPr>
+        <w:rPr>
+          <w:lang w:val="vi-VN"/>
+        </w:rPr>
+      </w:pPr>
+      <w:r>
+        <w:rPr>
+          <w:lang w:val="vi-VN"/>
+        </w:rPr>
+        <w:t>i: Information: Các thông tin khác</w:t>
+      </w:r>
+      <w:r>
+        <w:rPr>
+          <w:lang w:val="vi-VN"/>
+        </w:rPr>
+        <w:t xml:space="preserve"> </w:t>
+      </w:r>
+    </w:p>
+    <w:p>
+      <w:pPr>
+        <w:rPr>
+          <w:lang w:val="vi-VN"/>
+        </w:rPr>
+      </w:pPr>
+      <w:r>
+        <w:rPr>
+          <w:noProof/>
+          <w:lang w:val="vi-VN"/>
+        </w:rPr>
+        <w:drawing>
+          <wp:inline distT="0" distB="0" distL="0" distR="0" wp14:anchorId="3D0F673E" wp14:editId="11058C49">
+            <wp:extent cx="5943600" cy="3089275"/>
+            <wp:effectExtent l="0" t="0" r="0" b="0"/>
+            <wp:docPr id="1745393636" name="Picture 1"/>
+            <wp:cNvGraphicFramePr>
+              <a:graphicFrameLocks xmlns:a="http://schemas.openxmlformats.org/drawingml/2006/main" noChangeAspect="1"/>
+            </wp:cNvGraphicFramePr>
+            <a:graphic xmlns:a="http://schemas.openxmlformats.org/drawingml/2006/main">
+              <a:graphicData uri="http://schemas.openxmlformats.org/drawingml/2006/picture">
+                <pic:pic xmlns:pic="http://schemas.openxmlformats.org/drawingml/2006/picture">
+                  <pic:nvPicPr>
+                    <pic:cNvPr id="1745393636" name=""/>
+                    <pic:cNvPicPr/>
+                  </pic:nvPicPr>
+                  <pic:blipFill>
+                    <a:blip r:embed="rId5"/>
+                    <a:stretch>
+                      <a:fillRect/>
+                    </a:stretch>
+                  </pic:blipFill>
+                  <pic:spPr>
+                    <a:xfrm>
+                      <a:off x="0" y="0"/>
+                      <a:ext cx="5943600" cy="3089275"/>
+                    </a:xfrm>
+                    <a:prstGeom prst="rect">
+                      <a:avLst/>
+                    </a:prstGeom>
+                  </pic:spPr>
+                </pic:pic>
+              </a:graphicData>
+            </a:graphic>
+          </wp:inline>
+        </w:drawing>
+      </w:r>
+    </w:p>
+    <w:p>
+      <w:pPr>
+        <w:rPr>
+          <w:lang w:val="vi-VN"/>
+        </w:rPr>
+      </w:pPr>
+      <w:r>
+        <w:rPr>
+          <w:lang w:val="vi-VN"/>
+        </w:rPr>
+        <w:lastRenderedPageBreak/>
+        <w:t xml:space="preserve">Sau các thông tin hiển thị chính, ta đến với màn hình giám sát của vị trí sản phẩm được theo dõi, và viền màn hình thể hiện trạng thái sản phẩm như xanh: đang chạy, vàng: đang chuẩn bị, đỏ: đang dừng. </w:t>
+      </w:r>
+    </w:p>
+    <w:p>
+      <w:pPr>
+        <w:rPr>
+          <w:lang w:val="vi-VN"/>
+        </w:rPr>
+      </w:pPr>
+      <w:r>
+        <w:rPr>
+          <w:lang w:val="vi-VN"/>
+        </w:rPr>
+        <w:t>Cuối cùng là các nút nhấn với từng chức năng cụ thể:</w:t>
+      </w:r>
+    </w:p>
+    <w:p>
+      <w:pPr>
+        <w:rPr>
+          <w:lang w:val="vi-VN"/>
+        </w:rPr>
+      </w:pPr>
+      <w:r>
+        <w:rPr>
+          <w:lang w:val="vi-VN"/>
+        </w:rPr>
+        <w:t>- Defect:</w:t>
+      </w:r>
+      <w:r>
+        <w:rPr>
+          <w:lang w:val="vi-VN"/>
+        </w:rPr>
+        <w:t xml:space="preserve"> </w:t>
+      </w:r>
+      <w:r>
+        <w:rPr>
+          <w:lang w:val="vi-VN"/>
+        </w:rPr>
+        <w:t>Sản phẩm có bất thường</w:t>
+      </w:r>
+    </w:p>
+    <w:p>
+      <w:pPr>
+        <w:rPr>
+          <w:lang w:val="vi-VN"/>
+        </w:rPr>
+      </w:pPr>
+      <w:r>
+        <w:rPr>
+          <w:lang w:val="vi-VN"/>
+        </w:rPr>
+        <w:t>- Buyoff:</w:t>
+      </w:r>
+      <w:r>
+        <w:rPr>
+          <w:lang w:val="vi-VN"/>
+        </w:rPr>
+        <w:t xml:space="preserve"> Xử lý thủ công để tiếp tục truyền</w:t>
+      </w:r>
+    </w:p>
+    <w:p>
+      <w:pPr>
+        <w:rPr>
+          <w:lang w:val="vi-VN"/>
+        </w:rPr>
+      </w:pPr>
+      <w:r>
+        <w:rPr>
+          <w:lang w:val="vi-VN"/>
+        </w:rPr>
+        <w:t>- Rework:</w:t>
+      </w:r>
+      <w:r>
+        <w:rPr>
+          <w:lang w:val="vi-VN"/>
+        </w:rPr>
+        <w:t xml:space="preserve"> Chuyển line làm lại</w:t>
+      </w:r>
+    </w:p>
+    <w:p>
+      <w:pPr>
+        <w:rPr>
+          <w:lang w:val="vi-VN"/>
+        </w:rPr>
+      </w:pPr>
+      <w:r>
+        <w:rPr>
+          <w:lang w:val="vi-VN"/>
+        </w:rPr>
+        <w:t>- Scrap:</w:t>
+      </w:r>
+      <w:r>
+        <w:rPr>
+          <w:lang w:val="vi-VN"/>
+        </w:rPr>
+        <w:t xml:space="preserve"> Bỏ đi</w:t>
+      </w:r>
+    </w:p>
+    <w:p>
+      <w:pPr>
+        <w:rPr>
+          <w:lang w:val="vi-VN"/>
+        </w:rPr>
+      </w:pPr>
+      <w:r>
+        <w:rPr>
+          <w:lang w:val="vi-VN"/>
+        </w:rPr>
+        <w:t>- Andon:</w:t>
+      </w:r>
+      <w:r>
+        <w:rPr>
+          <w:lang w:val="vi-VN"/>
+        </w:rPr>
+        <w:t xml:space="preserve"> Báo cáo </w:t>
+      </w:r>
+      <w:r>
+        <w:rPr>
+          <w:lang w:val="vi-VN"/>
+        </w:rPr>
+        <w:t>tổ trưởng</w:t>
+      </w:r>
+    </w:p>
+    <w:p>
+      <w:pPr>
+        <w:rPr>
+          <w:lang w:val="vi-VN"/>
+        </w:rPr>
+      </w:pPr>
+      <w:r>
+        <w:rPr>
+          <w:lang w:val="vi-VN"/>
+        </w:rPr>
+        <w:t>- Release:</w:t>
+      </w:r>
+      <w:r>
+        <w:rPr>
+          <w:lang w:val="vi-VN"/>
+        </w:rPr>
+        <w:t xml:space="preserve"> Công bố</w:t>
+      </w:r>
+    </w:p>
+    <w:p>
+      <w:pPr>
+        <w:rPr>
+          <w:lang w:val="vi-VN"/>
+        </w:rPr>
+      </w:pPr>
+      <w:r>
+        <w:rPr>
+          <w:lang w:val="vi-VN"/>
+        </w:rPr>
+        <w:t xml:space="preserve">- Approve: </w:t>
+      </w:r>
+      <w:r>
+        <w:rPr>
+          <w:lang w:val="vi-VN"/>
+        </w:rPr>
+        <w:t>Chấp thuận</w:t>
+      </w:r>
+    </w:p>
+    <w:p>
+      <w:pPr>
+        <w:rPr>
+          <w:lang w:val="vi-VN"/>
+        </w:rPr>
+      </w:pPr>
+      <w:r>
+        <w:rPr>
+          <w:lang w:val="vi-VN"/>
+        </w:rPr>
+        <w:t xml:space="preserve">- In: </w:t>
+      </w:r>
+      <w:r>
+        <w:rPr>
+          <w:lang w:val="vi-VN"/>
+        </w:rPr>
+        <w:t>TrackIn đưa thành phẩm vào</w:t>
+      </w:r>
+    </w:p>
+    <w:p>
+      <w:pPr>
+        <w:rPr>
+          <w:lang w:val="vi-VN"/>
+        </w:rPr>
+      </w:pPr>
+      <w:r>
+        <w:rPr>
+          <w:lang w:val="vi-VN"/>
+        </w:rPr>
+        <w:t>- Out:</w:t>
+      </w:r>
+      <w:r>
+        <w:rPr>
+          <w:lang w:val="vi-VN"/>
+        </w:rPr>
+        <w:t xml:space="preserve"> TrackOut đưa thành phẩm ra</w:t>
+      </w:r>
+    </w:p>
+    <w:p>
+      <w:pPr>
+        <w:rPr>
+          <w:lang w:val="vi-VN"/>
+        </w:rPr>
+      </w:pPr>
+      <w:r>
+        <w:rPr>
+          <w:lang w:val="vi-VN"/>
+        </w:rPr>
+        <w:t>- Start:</w:t>
+      </w:r>
+      <w:r>
+        <w:rPr>
+          <w:lang w:val="vi-VN"/>
+        </w:rPr>
+        <w:t xml:space="preserve"> Bắt đầu</w:t>
+      </w:r>
+    </w:p>
+    <w:p>
+      <w:pPr>
+        <w:rPr>
+          <w:lang w:val="vi-VN"/>
+        </w:rPr>
+      </w:pPr>
+      <w:r>
+        <w:rPr>
+          <w:lang w:val="vi-VN"/>
+        </w:rPr>
+        <w:t xml:space="preserve">- Stop: </w:t>
+      </w:r>
+      <w:r>
+        <w:rPr>
+          <w:lang w:val="vi-VN"/>
+        </w:rPr>
+        <w:t>Dừng</w:t>
+      </w:r>
+    </w:p>
+    <w:p>
+      <w:pPr>
+        <w:rPr>
+          <w:lang w:val="vi-VN"/>
+        </w:rPr>
+      </w:pPr>
+      <w:r>
+        <w:rPr>
+          <w:lang w:val="vi-VN"/>
+        </w:rPr>
+        <w:t xml:space="preserve">- Hold: </w:t>
+      </w:r>
+      <w:r>
+        <w:rPr>
+          <w:lang w:val="vi-VN"/>
+        </w:rPr>
+        <w:t>Giữ lại</w:t>
+      </w:r>
+    </w:p>
+    <w:p>
+      <w:pPr>
+        <w:rPr>
+          <w:lang w:val="vi-VN"/>
+        </w:rPr>
+      </w:pPr>
+      <w:r>
+        <w:rPr>
+          <w:lang w:val="vi-VN"/>
+        </w:rPr>
+        <w:t>- Lock:</w:t>
+      </w:r>
+      <w:r>
+        <w:rPr>
+          <w:lang w:val="vi-VN"/>
+        </w:rPr>
+        <w:t xml:space="preserve"> Khóa</w:t>
+      </w:r>
+    </w:p>
+    <w:p>
+      <w:pPr>
+        <w:rPr>
+          <w:lang w:val="vi-VN"/>
+        </w:rPr>
+      </w:pPr>
+      <w:r>
+        <w:rPr>
+          <w:lang w:val="vi-VN"/>
+        </w:rPr>
+        <w:t xml:space="preserve">- Confirm: </w:t>
+      </w:r>
+      <w:r>
+        <w:rPr>
+          <w:lang w:val="vi-VN"/>
+        </w:rPr>
+        <w:t>Xác nhận</w:t>
+      </w:r>
+    </w:p>
+    <w:p>
+      <w:pPr>
+        <w:rPr>
+          <w:lang w:val="vi-VN"/>
+        </w:rPr>
+      </w:pPr>
+      <w:r>
+        <w:rPr>
+          <w:lang w:val="vi-VN"/>
+        </w:rPr>
+        <w:t>3.2.2.</w:t>
+      </w:r>
+      <w:r>
+        <w:rPr>
+          <w:lang w:val="vi-VN"/>
+        </w:rPr>
+        <w:t xml:space="preserve"> Giao diện huấn luyện dữ liệu</w:t>
+      </w:r>
+    </w:p>
+    <w:p>
+      <w:pPr>
+        <w:rPr>
+          <w:lang w:val="vi-VN"/>
+        </w:rPr>
+      </w:pPr>
+      <w:r>
+        <w:rPr>
+          <w:lang w:val="vi-VN"/>
+        </w:rPr>
+        <w:t>Để sản phẩm được thông qua chính xác và tự động hơn trong quá trình giám sát, việc để cho các thiết bị máy móc học tập là vô cùng quan trọng. Tương tự với các hệ thống nhận dạng khác, SmartCheck cũng thông qua các bước: chuẩn bị dữ liệu, xử lý dữ liệu tạo Dataset, xây dựng Model huấn luyện, huấn luyện dữ liệu, đánh giá dữ liệu.</w:t>
+      </w:r>
+    </w:p>
+    <w:p>
+      <w:pPr>
+        <w:rPr>
+          <w:lang w:val="vi-VN"/>
+        </w:rPr>
+      </w:pPr>
+      <w:r>
+        <w:rPr>
+          <w:lang w:val="vi-VN"/>
+        </w:rPr>
+        <w:t>3.2.</w:t>
+      </w:r>
+      <w:r>
+        <w:rPr>
+          <w:lang w:val="vi-VN"/>
+        </w:rPr>
+        <w:t>2</w:t>
+      </w:r>
+      <w:r>
+        <w:rPr>
+          <w:lang w:val="vi-VN"/>
+        </w:rPr>
+        <w:t>.</w:t>
+      </w:r>
+      <w:r>
+        <w:rPr>
+          <w:lang w:val="vi-VN"/>
+        </w:rPr>
+        <w:t>1. Dataset</w:t>
+      </w:r>
+    </w:p>
+    <w:p>
+      <w:pPr>
+        <w:rPr>
+          <w:lang w:val="vi-VN"/>
+        </w:rPr>
+      </w:pPr>
+      <w:r>
+        <w:rPr>
+          <w:lang w:val="vi-VN"/>
+        </w:rPr>
+        <w:t>Sau khi đã có dữ liệu được chuẩn hóa tại thiết bị, ta upload lên hệ thống. Hệ thống sẽ hiển thị các trường dữ liệu: tên dataset, số lượng dữ liệu trong dataset: rows, dữ liệu: feature, nhãn: target.</w:t>
+      </w:r>
+    </w:p>
+    <w:p>
+      <w:pPr>
+        <w:rPr>
+          <w:lang w:val="vi-VN"/>
+        </w:rPr>
+      </w:pPr>
+      <w:r>
+        <w:rPr>
+          <w:lang w:val="vi-VN"/>
+        </w:rPr>
+        <w:t>Màn hình logs sẽ hiển thị quá trình nhận dữ liệu và kiểm tra bộ dữ liệu một cách hoàn chỉnh.</w:t>
+      </w:r>
+    </w:p>
+    <w:p>
+      <w:pPr>
+        <w:rPr>
+          <w:lang w:val="vi-VN"/>
+        </w:rPr>
+      </w:pPr>
+      <w:r>
+        <w:rPr>
+          <w:lang w:val="vi-VN"/>
+        </w:rPr>
+        <w:lastRenderedPageBreak/>
+        <w:t>Ta có thể xem lại dataset bằng nút preview. Nếu không có gì thay đổi, chọn select để xác nhận và chọn next để đến bước tiếp theo.</w:t>
+      </w:r>
+    </w:p>
+    <w:p>
+      <w:pPr>
+        <w:rPr>
+          <w:lang w:val="vi-VN"/>
+        </w:rPr>
+      </w:pPr>
+      <w:r>
+        <w:rPr>
+          <w:noProof/>
+          <w:lang w:val="vi-VN"/>
+        </w:rPr>
+        <w:drawing>
+          <wp:inline distT="0" distB="0" distL="0" distR="0" wp14:anchorId="6CE2C012" wp14:editId="04950D7C">
+            <wp:extent cx="5943600" cy="3050540"/>
+            <wp:effectExtent l="0" t="0" r="0" b="0"/>
+            <wp:docPr id="1170336125" name="Picture 1"/>
+            <wp:cNvGraphicFramePr>
+              <a:graphicFrameLocks xmlns:a="http://schemas.openxmlformats.org/drawingml/2006/main" noChangeAspect="1"/>
+            </wp:cNvGraphicFramePr>
+            <a:graphic xmlns:a="http://schemas.openxmlformats.org/drawingml/2006/main">
+              <a:graphicData uri="http://schemas.openxmlformats.org/drawingml/2006/picture">
+                <pic:pic xmlns:pic="http://schemas.openxmlformats.org/drawingml/2006/picture">
+                  <pic:nvPicPr>
+                    <pic:cNvPr id="1170336125" name=""/>
+                    <pic:cNvPicPr/>
+                  </pic:nvPicPr>
+                  <pic:blipFill>
+                    <a:blip r:embed="rId6"/>
+                    <a:stretch>
+                      <a:fillRect/>
+                    </a:stretch>
+                  </pic:blipFill>
+                  <pic:spPr>
+                    <a:xfrm>
+                      <a:off x="0" y="0"/>
+                      <a:ext cx="5943600" cy="3050540"/>
+                    </a:xfrm>
+                    <a:prstGeom prst="rect">
+                      <a:avLst/>
+                    </a:prstGeom>
+                  </pic:spPr>
+                </pic:pic>
+              </a:graphicData>
+            </a:graphic>
+          </wp:inline>
+        </w:drawing>
+      </w:r>
+    </w:p>
+    <w:p>
+      <w:pPr>
+        <w:rPr>
+          <w:lang w:val="vi-VN"/>
+        </w:rPr>
+      </w:pPr>
+      <w:r>
+        <w:rPr>
+          <w:lang w:val="vi-VN"/>
+        </w:rPr>
+        <w:t>3.2.</w:t>
+      </w:r>
+      <w:r>
+        <w:rPr>
+          <w:lang w:val="vi-VN"/>
+        </w:rPr>
+        <w:t>2</w:t>
+      </w:r>
+      <w:r>
+        <w:rPr>
+          <w:lang w:val="vi-VN"/>
+        </w:rPr>
+        <w:t>.</w:t>
+      </w:r>
+      <w:r>
+        <w:rPr>
+          <w:lang w:val="vi-VN"/>
+        </w:rPr>
+        <w:t>2. Model</w:t>
+      </w:r>
+    </w:p>
+    <w:p>
+      <w:pPr>
+        <w:rPr>
+          <w:lang w:val="vi-VN"/>
+        </w:rPr>
+      </w:pPr>
+      <w:r>
+        <w:rPr>
+          <w:lang w:val="vi-VN"/>
+        </w:rPr>
+        <w:t xml:space="preserve">Sau khi có dataset, ta thực hiện chọn model. Ở đây, chúng ta được cung cấp Model có sẵn, và model tùy chỉnh được lựa chọn qua </w:t>
+      </w:r>
+      <w:r>
+        <w:rPr>
+          <w:lang w:val="vi-VN"/>
+        </w:rPr>
+        <w:t>Drop</w:t>
+      </w:r>
+      <w:r>
+        <w:rPr>
+          <w:lang w:val="vi-VN"/>
+        </w:rPr>
+        <w:t xml:space="preserve">down để upload hoặc lựa chọn có sẵn qua nút auto. </w:t>
+      </w:r>
+      <w:r>
+        <w:rPr>
+          <w:lang w:val="vi-VN"/>
+        </w:rPr>
+        <w:t>Tương</w:t>
+      </w:r>
+      <w:r>
+        <w:rPr>
+          <w:lang w:val="vi-VN"/>
+        </w:rPr>
+        <w:t xml:space="preserve"> tự như Dataset, ở đây cũng có thông tin riêng cho model và logs đảm bảo model không có vấn đề trước khi tiến hành huấn luyện.</w:t>
+      </w:r>
+    </w:p>
+    <w:p>
+      <w:pPr>
+        <w:rPr>
+          <w:lang w:val="vi-VN"/>
+        </w:rPr>
+      </w:pPr>
+      <w:r>
+        <w:rPr>
+          <w:noProof/>
+          <w:lang w:val="vi-VN"/>
+        </w:rPr>
+        <w:drawing>
+          <wp:inline distT="0" distB="0" distL="0" distR="0" wp14:anchorId="6CBFBFF7" wp14:editId="719F066E">
+            <wp:extent cx="5943600" cy="3038475"/>
+            <wp:effectExtent l="0" t="0" r="0" b="9525"/>
+            <wp:docPr id="234000512" name="Picture 1"/>
+            <wp:cNvGraphicFramePr>
+              <a:graphicFrameLocks xmlns:a="http://schemas.openxmlformats.org/drawingml/2006/main" noChangeAspect="1"/>
+            </wp:cNvGraphicFramePr>
+            <a:graphic xmlns:a="http://schemas.openxmlformats.org/drawingml/2006/main">
+              <a:graphicData uri="http://schemas.openxmlformats.org/drawingml/2006/picture">
+                <pic:pic xmlns:pic="http://schemas.openxmlformats.org/drawingml/2006/picture">
+                  <pic:nvPicPr>
+                    <pic:cNvPr id="234000512" name=""/>
+                    <pic:cNvPicPr/>
+                  </pic:nvPicPr>
+                  <pic:blipFill>
+                    <a:blip r:embed="rId7"/>
+                    <a:stretch>
+                      <a:fillRect/>
+                    </a:stretch>
+                  </pic:blipFill>
+                  <pic:spPr>
+                    <a:xfrm>
+                      <a:off x="0" y="0"/>
+                      <a:ext cx="5943600" cy="3038475"/>
+                    </a:xfrm>
+                    <a:prstGeom prst="rect">
+                      <a:avLst/>
+                    </a:prstGeom>
+                  </pic:spPr>
+                </pic:pic>
+              </a:graphicData>
+            </a:graphic>
+          </wp:inline>
+        </w:drawing>
+      </w:r>
+    </w:p>
+    <w:p>
+      <w:pPr>
+        <w:rPr>
+          <w:lang w:val="vi-VN"/>
+        </w:rPr>
+      </w:pPr>
+      <w:r>
+        <w:rPr>
+          <w:lang w:val="vi-VN"/>
+        </w:rPr>
+        <w:lastRenderedPageBreak/>
+        <w:t xml:space="preserve">3.2.2.3. </w:t>
+      </w:r>
+      <w:r>
+        <w:rPr>
+          <w:lang w:val="vi-VN"/>
+        </w:rPr>
+        <w:t>Train</w:t>
+      </w:r>
+    </w:p>
+    <w:p>
+      <w:pPr>
+        <w:rPr>
+          <w:lang w:val="vi-VN"/>
+        </w:rPr>
+      </w:pPr>
+      <w:r>
+        <w:rPr>
+          <w:lang w:val="vi-VN"/>
+        </w:rPr>
+        <w:t>Sau bước lựa chọn mô hình, hệ thống sẽ tới màn huấn luyện dữ liệu. Người dùng sử dụng các nút để thao tác như bắt đầu, tạm dừng, ngừng và huấn luyện lại. Thông tin thời gian, và quá trình sẽ hiển thị bên cạnh màn hình chính. Đồng thời, các vấn đề, lỗi sẽ hiển thị ở logs phía dưới. Khi huấn luyện xong, người dùng có thể từ chối hoặc chấp chận việc huấn luyện lần này.</w:t>
+      </w:r>
+    </w:p>
+    <w:p>
+      <w:pPr>
+        <w:rPr>
+          <w:lang w:val="vi-VN"/>
+        </w:rPr>
+      </w:pPr>
+      <w:r>
+        <w:rPr>
+          <w:noProof/>
+          <w:lang w:val="vi-VN"/>
+        </w:rPr>
+        <w:drawing>
+          <wp:inline distT="0" distB="0" distL="0" distR="0" wp14:anchorId="121700D3" wp14:editId="6E1130F8">
+            <wp:extent cx="5943600" cy="3042285"/>
+            <wp:effectExtent l="0" t="0" r="0" b="5715"/>
+            <wp:docPr id="1492871627" name="Picture 1"/>
+            <wp:cNvGraphicFramePr>
+              <a:graphicFrameLocks xmlns:a="http://schemas.openxmlformats.org/drawingml/2006/main" noChangeAspect="1"/>
+            </wp:cNvGraphicFramePr>
+            <a:graphic xmlns:a="http://schemas.openxmlformats.org/drawingml/2006/main">
+              <a:graphicData uri="http://schemas.openxmlformats.org/drawingml/2006/picture">
+                <pic:pic xmlns:pic="http://schemas.openxmlformats.org/drawingml/2006/picture">
+                  <pic:nvPicPr>
+                    <pic:cNvPr id="1492871627" name=""/>
+                    <pic:cNvPicPr/>
+                  </pic:nvPicPr>
+                  <pic:blipFill>
+                    <a:blip r:embed="rId8"/>
+                    <a:stretch>
+                      <a:fillRect/>
+                    </a:stretch>
+                  </pic:blipFill>
+                  <pic:spPr>
+                    <a:xfrm>
+                      <a:off x="0" y="0"/>
+                      <a:ext cx="5943600" cy="3042285"/>
+                    </a:xfrm>
+                    <a:prstGeom prst="rect">
+                      <a:avLst/>
+                    </a:prstGeom>
+                  </pic:spPr>
+                </pic:pic>
+              </a:graphicData>
+            </a:graphic>
+          </wp:inline>
+        </w:drawing>
+      </w:r>
+    </w:p>
+    <w:p>
+      <w:pPr>
+        <w:rPr>
+          <w:lang w:val="vi-VN"/>
+        </w:rPr>
+      </w:pPr>
+      <w:r>
+        <w:rPr>
+          <w:lang w:val="vi-VN"/>
+        </w:rPr>
+        <w:t xml:space="preserve">3.2.2.4. </w:t>
+      </w:r>
+      <w:r>
+        <w:rPr>
+          <w:lang w:val="vi-VN"/>
+        </w:rPr>
+        <w:t>Eval</w:t>
+      </w:r>
+      <w:r>
+        <w:rPr>
+          <w:lang w:val="vi-VN"/>
+        </w:rPr>
+        <w:t>uation</w:t>
+      </w:r>
+    </w:p>
+    <w:p>
+      <w:pPr>
+        <w:rPr>
+          <w:lang w:val="vi-VN"/>
+        </w:rPr>
+      </w:pPr>
+      <w:r>
+        <w:rPr>
+          <w:lang w:val="vi-VN"/>
+        </w:rPr>
+        <w:t>Sau khi đã chấp nhận việc huấn luyện mô hình, người dùng được chuyển đến màn hình đánh giá.</w:t>
+      </w:r>
+      <w:r>
+        <w:rPr>
+          <w:lang w:val="vi-VN"/>
+        </w:rPr>
+        <w:t xml:space="preserve"> Ở đây, người dùng có thể xem các thông tin tương tự các bước trên. Bên cạnh đó, có thể so sánh với các mô hình trước, xuất mô hình và hoàn tất quá trình ở đây.</w:t>
+      </w:r>
+    </w:p>
+    <w:p>
+      <w:pPr>
+        <w:rPr>
+          <w:lang w:val="vi-VN"/>
+        </w:rPr>
+      </w:pPr>
+      <w:r>
+        <w:rPr>
+          <w:noProof/>
+          <w:lang w:val="vi-VN"/>
+        </w:rPr>
+        <w:lastRenderedPageBreak/>
+        <w:drawing>
+          <wp:inline distT="0" distB="0" distL="0" distR="0" wp14:anchorId="07C840EC" wp14:editId="3BB0BAFE">
+            <wp:extent cx="5943600" cy="3035935"/>
+            <wp:effectExtent l="0" t="0" r="0" b="0"/>
+            <wp:docPr id="74499267" name="Picture 1"/>
+            <wp:cNvGraphicFramePr>
+              <a:graphicFrameLocks xmlns:a="http://schemas.openxmlformats.org/drawingml/2006/main" noChangeAspect="1"/>
+            </wp:cNvGraphicFramePr>
+            <a:graphic xmlns:a="http://schemas.openxmlformats.org/drawingml/2006/main">
+              <a:graphicData uri="http://schemas.openxmlformats.org/drawingml/2006/picture">
+                <pic:pic xmlns:pic="http://schemas.openxmlformats.org/drawingml/2006/picture">
+                  <pic:nvPicPr>
+                    <pic:cNvPr id="74499267" name=""/>
+                    <pic:cNvPicPr/>
+                  </pic:nvPicPr>
+                  <pic:blipFill>
+                    <a:blip r:embed="rId9"/>
+                    <a:stretch>
+                      <a:fillRect/>
+                    </a:stretch>
+                  </pic:blipFill>
+                  <pic:spPr>
+                    <a:xfrm>
+                      <a:off x="0" y="0"/>
+                      <a:ext cx="5943600" cy="3035935"/>
+                    </a:xfrm>
+                    <a:prstGeom prst="rect">
+                      <a:avLst/>
+                    </a:prstGeom>
+                  </pic:spPr>
+                </pic:pic>
+              </a:graphicData>
+            </a:graphic>
+          </wp:inline>
+        </w:drawing>
+      </w:r>
+    </w:p>
+    <w:p>
+      <w:pPr>
+        <w:rPr>
+          <w:lang w:val="vi-VN"/>
+        </w:rPr>
+      </w:pPr>
+      <w:r>
+        <w:rPr>
+          <w:lang w:val="vi-VN"/>
+        </w:rPr>
+        <w:t>3.2.3. Giao diện báo cáo thống kê</w:t>
+      </w:r>
+    </w:p>
+    <w:p>
+      <w:pPr>
+        <w:rPr>
+          <w:lang w:val="vi-VN"/>
+        </w:rPr>
+      </w:pPr>
+      <w:r>
+        <w:rPr>
+          <w:lang w:val="vi-VN"/>
+        </w:rPr>
+        <w:t>Việc kiểm tra báo cáo, thống kê hàng ngày là không thể thiếu để đảm bảo quá trình sản xuất được diễn ra an toàn, chính xác và kịp tiến độ đề ra của người lãnh đạo.</w:t>
+      </w:r>
+      <w:r>
+        <w:rPr>
+          <w:lang w:val="vi-VN"/>
+        </w:rPr>
+        <w:t xml:space="preserve"> Ở đây, Smartcheck tập chung vào 3 khía cạnh chính là truyền sản xuất, sản phẩm trong quá trình sản xuất và các lỗi xảy ra trong quá trình sản xuất.</w:t>
+      </w:r>
+    </w:p>
+    <w:p>
+      <w:pPr>
+        <w:rPr>
+          <w:lang w:val="vi-VN"/>
+        </w:rPr>
+      </w:pPr>
+      <w:r>
+        <w:rPr>
+          <w:lang w:val="vi-VN"/>
+        </w:rPr>
+        <w:t>3.2.3.1. Line</w:t>
+      </w:r>
+    </w:p>
+    <w:p>
+      <w:pPr>
+        <w:rPr>
+          <w:lang w:val="vi-VN"/>
+        </w:rPr>
+      </w:pPr>
+      <w:r>
+        <w:rPr>
+          <w:lang w:val="vi-VN"/>
+        </w:rPr>
+        <w:t>Ở trên truyền, điều quan trọng nhất trong quá trình sản xuất là tránh việc dừng truyền.</w:t>
+      </w:r>
+      <w:r>
+        <w:rPr>
+          <w:lang w:val="vi-VN"/>
+        </w:rPr>
+        <w:t xml:space="preserve"> </w:t>
+      </w:r>
+      <w:r>
+        <w:rPr>
+          <w:lang w:val="vi-VN"/>
+        </w:rPr>
+        <w:t>Các cấp lãnh đạo, quản lý luôn tập trung vào việc truyền hôm nay hoạt động thế nào, có downtime không, và bao nhiêu giây.</w:t>
+      </w:r>
+      <w:r>
+        <w:rPr>
+          <w:lang w:val="vi-VN"/>
+        </w:rPr>
+        <w:t xml:space="preserve"> Hiệu suất của truyền đảm bảo đúng tiến độ hay </w:t>
+      </w:r>
+      <w:r>
+        <w:rPr>
+          <w:lang w:val="vi-VN"/>
+        </w:rPr>
+        <w:t>không, Tốc độ sản phẩm hàng ngày, hàng giờ có ổn định. Ở Smartcheck đã đảm bảo trực quan nhất thông qua trạng thái Run – Stop qua màu sắc, chữ cái hiển thị. Và luôn có cảnh báo kịp thời khi có sự cố xảy ra.</w:t>
+      </w:r>
+      <w:r>
+        <w:rPr>
+          <w:lang w:val="vi-VN"/>
+        </w:rPr>
+        <w:t xml:space="preserve"> Bên cạnh đó là các biểu đồ chỉ tốc độ của sản phẩm trên chuyền, năng suất của truyền.</w:t>
+      </w:r>
+      <w:r>
+        <w:rPr>
+          <w:lang w:val="vi-VN"/>
+        </w:rPr>
+        <w:t xml:space="preserve"> Báo cáo số liệu downtime gần nhất.</w:t>
+      </w:r>
+    </w:p>
+    <w:p>
+      <w:pPr>
+        <w:rPr>
+          <w:lang w:val="vi-VN"/>
+        </w:rPr>
+      </w:pPr>
+      <w:r>
+        <w:rPr>
+          <w:noProof/>
+          <w:lang w:val="vi-VN"/>
+        </w:rPr>
+        <w:lastRenderedPageBreak/>
+        <w:drawing>
+          <wp:inline distT="0" distB="0" distL="0" distR="0" wp14:anchorId="4A4DC816" wp14:editId="28E062E8">
+            <wp:extent cx="5943600" cy="3035300"/>
+            <wp:effectExtent l="0" t="0" r="0" b="0"/>
+            <wp:docPr id="1416529661" name="Picture 1"/>
+            <wp:cNvGraphicFramePr>
+              <a:graphicFrameLocks xmlns:a="http://schemas.openxmlformats.org/drawingml/2006/main" noChangeAspect="1"/>
+            </wp:cNvGraphicFramePr>
+            <a:graphic xmlns:a="http://schemas.openxmlformats.org/drawingml/2006/main">
+              <a:graphicData uri="http://schemas.openxmlformats.org/drawingml/2006/picture">
+                <pic:pic xmlns:pic="http://schemas.openxmlformats.org/drawingml/2006/picture">
+                  <pic:nvPicPr>
+                    <pic:cNvPr id="1416529661" name=""/>
+                    <pic:cNvPicPr/>
+                  </pic:nvPicPr>
+                  <pic:blipFill>
+                    <a:blip r:embed="rId10"/>
+                    <a:stretch>
+                      <a:fillRect/>
+                    </a:stretch>
+                  </pic:blipFill>
+                  <pic:spPr>
+                    <a:xfrm>
+                      <a:off x="0" y="0"/>
+                      <a:ext cx="5943600" cy="3035300"/>
+                    </a:xfrm>
+                    <a:prstGeom prst="rect">
+                      <a:avLst/>
+                    </a:prstGeom>
+                  </pic:spPr>
+                </pic:pic>
+              </a:graphicData>
+            </a:graphic>
+          </wp:inline>
+        </w:drawing>
+      </w:r>
+    </w:p>
+    <w:p>
+      <w:pPr>
+        <w:rPr>
+          <w:lang w:val="vi-VN"/>
+        </w:rPr>
+      </w:pPr>
+      <w:r>
+        <w:rPr>
+          <w:lang w:val="vi-VN"/>
+        </w:rPr>
+        <w:t>3.2.3.2. Product</w:t>
+      </w:r>
+    </w:p>
+    <w:p>
+      <w:pPr>
+        <w:rPr>
+          <w:lang w:val="vi-VN"/>
+        </w:rPr>
+      </w:pPr>
+      <w:r>
+        <w:rPr>
+          <w:lang w:val="vi-VN"/>
+        </w:rPr>
+        <w:t>Việc sản xuất hàng ngày có hiệu quả hay không, có cần cải tiến hay không, tất cả dựa vào KPI được đặt ra. Khi nhìn vào màn hình, ta có thể thấy rõ được số lượng sản xuất các thiết bị tổng quan, theo từng giờ, từng ngày, từng tháng, từng năm, số lượng đạt yêu cầu bao nhiêu. Từ đó mà cân đối quá trình sản xuất.</w:t>
+      </w:r>
+    </w:p>
+    <w:p>
+      <w:pPr>
+        <w:rPr>
+          <w:lang w:val="vi-VN"/>
+        </w:rPr>
+      </w:pPr>
+      <w:r>
+        <w:rPr>
+          <w:noProof/>
+          <w:lang w:val="vi-VN"/>
+        </w:rPr>
+        <w:drawing>
+          <wp:inline distT="0" distB="0" distL="0" distR="0" wp14:anchorId="2DE972E3" wp14:editId="02CA86FC">
+            <wp:extent cx="5943600" cy="3023235"/>
+            <wp:effectExtent l="0" t="0" r="0" b="5715"/>
+            <wp:docPr id="1388774758" name="Picture 1"/>
+            <wp:cNvGraphicFramePr>
+              <a:graphicFrameLocks xmlns:a="http://schemas.openxmlformats.org/drawingml/2006/main" noChangeAspect="1"/>
+            </wp:cNvGraphicFramePr>
+            <a:graphic xmlns:a="http://schemas.openxmlformats.org/drawingml/2006/main">
+              <a:graphicData uri="http://schemas.openxmlformats.org/drawingml/2006/picture">
+                <pic:pic xmlns:pic="http://schemas.openxmlformats.org/drawingml/2006/picture">
+                  <pic:nvPicPr>
+                    <pic:cNvPr id="1388774758" name=""/>
+                    <pic:cNvPicPr/>
+                  </pic:nvPicPr>
+                  <pic:blipFill>
+                    <a:blip r:embed="rId11"/>
+                    <a:stretch>
+                      <a:fillRect/>
+                    </a:stretch>
+                  </pic:blipFill>
+                  <pic:spPr>
+                    <a:xfrm>
+                      <a:off x="0" y="0"/>
+                      <a:ext cx="5943600" cy="3023235"/>
+                    </a:xfrm>
+                    <a:prstGeom prst="rect">
+                      <a:avLst/>
+                    </a:prstGeom>
+                  </pic:spPr>
+                </pic:pic>
+              </a:graphicData>
+            </a:graphic>
+          </wp:inline>
+        </w:drawing>
+      </w:r>
+    </w:p>
+    <w:p>
+      <w:pPr>
+        <w:rPr>
+          <w:lang w:val="vi-VN"/>
+        </w:rPr>
+      </w:pPr>
+      <w:r>
+        <w:rPr>
+          <w:lang w:val="vi-VN"/>
+        </w:rPr>
+        <w:t>3.2.3.3. Error</w:t>
+      </w:r>
+    </w:p>
+    <w:p>
+      <w:pPr>
+        <w:rPr>
+          <w:lang w:val="vi-VN"/>
+        </w:rPr>
+      </w:pPr>
+      <w:r>
+        <w:rPr>
+          <w:lang w:val="vi-VN"/>
+        </w:rPr>
+        <w:lastRenderedPageBreak/>
+        <w:t>Cuối cùng là một phần cũng không thể thiếu đó là thông tin về lỗi, của sản phẩm. Nhìn vào đây, ta có thể thấy rõ được lượng đạt yêu cầu là bao nhiêu, có những thành phần lỗi như nào. Ví dụ như sản phẩm vị thiếu thành phẩm nhỏ, bị biến dạng hay bị hư hại hoàn toàn. Tỉ lệ lỗi đạt bao nhiêu phần trăm.</w:t>
+      </w:r>
+    </w:p>
+    <w:p>
+      <w:pPr>
+        <w:rPr>
+          <w:lang w:val="vi-VN"/>
+        </w:rPr>
+      </w:pPr>
+      <w:r>
+        <w:rPr>
+          <w:noProof/>
+          <w:lang w:val="vi-VN"/>
+        </w:rPr>
+        <w:drawing>
+          <wp:inline distT="0" distB="0" distL="0" distR="0" wp14:anchorId="06336268" wp14:editId="36907A2D">
+            <wp:extent cx="5943600" cy="3023870"/>
+            <wp:effectExtent l="0" t="0" r="0" b="5080"/>
+            <wp:docPr id="213256104" name="Picture 1"/>
+            <wp:cNvGraphicFramePr>
+              <a:graphicFrameLocks xmlns:a="http://schemas.openxmlformats.org/drawingml/2006/main" noChangeAspect="1"/>
+            </wp:cNvGraphicFramePr>
+            <a:graphic xmlns:a="http://schemas.openxmlformats.org/drawingml/2006/main">
+              <a:graphicData uri="http://schemas.openxmlformats.org/drawingml/2006/picture">
+                <pic:pic xmlns:pic="http://schemas.openxmlformats.org/drawingml/2006/picture">
+                  <pic:nvPicPr>
+                    <pic:cNvPr id="213256104" name=""/>
+                    <pic:cNvPicPr/>
+                  </pic:nvPicPr>
+                  <pic:blipFill>
+                    <a:blip r:embed="rId12"/>
+                    <a:stretch>
+                      <a:fillRect/>
+                    </a:stretch>
+                  </pic:blipFill>
+                  <pic:spPr>
+                    <a:xfrm>
+                      <a:off x="0" y="0"/>
+                      <a:ext cx="5943600" cy="3023870"/>
+                    </a:xfrm>
+                    <a:prstGeom prst="rect">
+                      <a:avLst/>
+                    </a:prstGeom>
+                  </pic:spPr>
+                </pic:pic>
+              </a:graphicData>
+            </a:graphic>
+          </wp:inline>
+        </w:drawing>
+      </w:r>
     </w:p>
     <w:p>
       <w:pPr>

</xml_diff>